<commit_message>
Fix: Resolve Groq model deprecation and implement universal multi-cloud circuit breaker
</commit_message>
<xml_diff>
--- a/Monitor-real-Documentation.docx
+++ b/Monitor-real-Documentation.docx
@@ -55,25 +55,7 @@
           <w:sz w:val="24"/>
           <w:szCs w:val="24"/>
         </w:rPr>
-        <w:t xml:space="preserve">On Windows, it is vital to use a virtual </w:t>
-      </w:r>
-      <w:proofErr w:type="gramStart"/>
-      <w:r>
-        <w:rPr>
-          <w:rFonts w:ascii="Times New Roman" w:hAnsi="Times New Roman" w:cs="Times New Roman"/>
-          <w:sz w:val="24"/>
-          <w:szCs w:val="24"/>
-        </w:rPr>
-        <w:t>environment</w:t>
-      </w:r>
-      <w:proofErr w:type="gramEnd"/>
-      <w:r>
-        <w:rPr>
-          <w:rFonts w:ascii="Times New Roman" w:hAnsi="Times New Roman" w:cs="Times New Roman"/>
-          <w:sz w:val="24"/>
-          <w:szCs w:val="24"/>
-        </w:rPr>
-        <w:t xml:space="preserve"> so your project dependencies don't conflict with your global Python installation.</w:t>
+        <w:t>On Windows, it is vital to use a virtual environment so your project dependencies don't conflict with your global Python installation.</w:t>
       </w:r>
     </w:p>
     <w:p>
@@ -124,36 +106,8 @@
           <w:sz w:val="24"/>
           <w:szCs w:val="24"/>
         </w:rPr>
-        <w:t xml:space="preserve">python -m </w:t>
-      </w:r>
-      <w:proofErr w:type="spellStart"/>
-      <w:r>
-        <w:rPr>
-          <w:rFonts w:ascii="Times New Roman" w:hAnsi="Times New Roman" w:cs="Times New Roman"/>
-          <w:sz w:val="24"/>
-          <w:szCs w:val="24"/>
-        </w:rPr>
-        <w:t>venv</w:t>
-      </w:r>
-      <w:proofErr w:type="spellEnd"/>
-      <w:r>
-        <w:rPr>
-          <w:rFonts w:ascii="Times New Roman" w:hAnsi="Times New Roman" w:cs="Times New Roman"/>
-          <w:sz w:val="24"/>
-          <w:szCs w:val="24"/>
-        </w:rPr>
-        <w:t xml:space="preserve"> </w:t>
-      </w:r>
-      <w:proofErr w:type="spellStart"/>
-      <w:r>
-        <w:rPr>
-          <w:rFonts w:ascii="Times New Roman" w:hAnsi="Times New Roman" w:cs="Times New Roman"/>
-          <w:sz w:val="24"/>
-          <w:szCs w:val="24"/>
-        </w:rPr>
-        <w:t>venv</w:t>
-      </w:r>
-      <w:proofErr w:type="spellEnd"/>
+        <w:t>python -m venv venv</w:t>
+      </w:r>
     </w:p>
     <w:p>
       <w:pPr>
@@ -212,25 +166,7 @@
           <w:sz w:val="24"/>
           <w:szCs w:val="24"/>
         </w:rPr>
-        <w:t xml:space="preserve"> That green (</w:t>
-      </w:r>
-      <w:proofErr w:type="spellStart"/>
-      <w:r>
-        <w:rPr>
-          <w:rFonts w:ascii="Times New Roman" w:hAnsi="Times New Roman" w:cs="Times New Roman"/>
-          <w:sz w:val="24"/>
-          <w:szCs w:val="24"/>
-        </w:rPr>
-        <w:t>venv</w:t>
-      </w:r>
-      <w:proofErr w:type="spellEnd"/>
-      <w:r>
-        <w:rPr>
-          <w:rFonts w:ascii="Times New Roman" w:hAnsi="Times New Roman" w:cs="Times New Roman"/>
-          <w:sz w:val="24"/>
-          <w:szCs w:val="24"/>
-        </w:rPr>
-        <w:t>) means your virtual environment is officially locked down and isolated.</w:t>
+        <w:t xml:space="preserve"> That green (venv) means your virtual environment is officially locked down and isolated.</w:t>
       </w:r>
     </w:p>
     <w:p>
@@ -298,133 +234,41 @@
           <w:sz w:val="24"/>
           <w:szCs w:val="24"/>
         </w:rPr>
-        <w:t>.\</w:t>
-      </w:r>
-      <w:proofErr w:type="spellStart"/>
-      <w:r>
-        <w:rPr>
-          <w:rFonts w:ascii="Times New Roman" w:hAnsi="Times New Roman" w:cs="Times New Roman"/>
-          <w:sz w:val="24"/>
-          <w:szCs w:val="24"/>
-        </w:rPr>
-        <w:t>venv</w:t>
-      </w:r>
-      <w:proofErr w:type="spellEnd"/>
-      <w:r>
-        <w:rPr>
-          <w:rFonts w:ascii="Times New Roman" w:hAnsi="Times New Roman" w:cs="Times New Roman"/>
-          <w:sz w:val="24"/>
-          <w:szCs w:val="24"/>
-        </w:rPr>
-        <w:t>\bin\Activate.ps1</w:t>
-      </w:r>
-    </w:p>
-    <w:p>
-      <w:pPr>
-        <w:rPr>
-          <w:rFonts w:ascii="Times New Roman" w:hAnsi="Times New Roman" w:cs="Times New Roman"/>
-          <w:sz w:val="24"/>
-          <w:szCs w:val="24"/>
-        </w:rPr>
-      </w:pPr>
-    </w:p>
-    <w:p>
-      <w:pPr>
-        <w:rPr>
-          <w:rFonts w:ascii="Times New Roman" w:hAnsi="Times New Roman" w:cs="Times New Roman"/>
-          <w:sz w:val="24"/>
-          <w:szCs w:val="24"/>
-        </w:rPr>
-      </w:pPr>
-      <w:r>
-        <w:rPr>
-          <w:rFonts w:ascii="Times New Roman" w:hAnsi="Times New Roman" w:cs="Times New Roman"/>
-          <w:sz w:val="24"/>
-          <w:szCs w:val="24"/>
-        </w:rPr>
-        <w:t xml:space="preserve">Next </w:t>
-      </w:r>
-      <w:proofErr w:type="gramStart"/>
-      <w:r>
-        <w:rPr>
-          <w:rFonts w:ascii="Times New Roman" w:hAnsi="Times New Roman" w:cs="Times New Roman"/>
-          <w:sz w:val="24"/>
-          <w:szCs w:val="24"/>
-        </w:rPr>
-        <w:t>Step :</w:t>
-      </w:r>
-      <w:proofErr w:type="gramEnd"/>
-      <w:r>
-        <w:rPr>
-          <w:rFonts w:ascii="Times New Roman" w:hAnsi="Times New Roman" w:cs="Times New Roman"/>
-          <w:sz w:val="24"/>
-          <w:szCs w:val="24"/>
-        </w:rPr>
-        <w:t xml:space="preserve"> </w:t>
-      </w:r>
-      <w:proofErr w:type="gramStart"/>
-      <w:r>
-        <w:rPr>
-          <w:rFonts w:ascii="Times New Roman" w:hAnsi="Times New Roman" w:cs="Times New Roman"/>
-          <w:sz w:val="24"/>
-          <w:szCs w:val="24"/>
-        </w:rPr>
-        <w:t>Make  a</w:t>
-      </w:r>
-      <w:proofErr w:type="gramEnd"/>
-      <w:r>
-        <w:rPr>
-          <w:rFonts w:ascii="Times New Roman" w:hAnsi="Times New Roman" w:cs="Times New Roman"/>
-          <w:sz w:val="24"/>
-          <w:szCs w:val="24"/>
-        </w:rPr>
-        <w:t xml:space="preserve"> folder inside safe-au</w:t>
-      </w:r>
-      <w:r>
-        <w:rPr>
-          <w:rFonts w:ascii="Times New Roman" w:hAnsi="Times New Roman" w:cs="Times New Roman"/>
-          <w:sz w:val="24"/>
-          <w:szCs w:val="24"/>
-        </w:rPr>
-        <w:t xml:space="preserve">dio-backend not in </w:t>
-      </w:r>
-      <w:proofErr w:type="spellStart"/>
-      <w:proofErr w:type="gramStart"/>
-      <w:r>
-        <w:rPr>
-          <w:rFonts w:ascii="Times New Roman" w:hAnsi="Times New Roman" w:cs="Times New Roman"/>
-          <w:sz w:val="24"/>
-          <w:szCs w:val="24"/>
-        </w:rPr>
-        <w:t>venv</w:t>
-      </w:r>
-      <w:proofErr w:type="spellEnd"/>
-      <w:r>
-        <w:rPr>
-          <w:rFonts w:ascii="Times New Roman" w:hAnsi="Times New Roman" w:cs="Times New Roman"/>
-          <w:sz w:val="24"/>
-          <w:szCs w:val="24"/>
-        </w:rPr>
-        <w:t>(</w:t>
-      </w:r>
-      <w:proofErr w:type="spellStart"/>
-      <w:proofErr w:type="gramEnd"/>
-      <w:r>
-        <w:rPr>
-          <w:rFonts w:ascii="Times New Roman" w:hAnsi="Times New Roman" w:cs="Times New Roman"/>
-          <w:sz w:val="24"/>
-          <w:szCs w:val="24"/>
-        </w:rPr>
-        <w:t>venv</w:t>
-      </w:r>
-      <w:proofErr w:type="spellEnd"/>
-      <w:r>
-        <w:rPr>
-          <w:rFonts w:ascii="Times New Roman" w:hAnsi="Times New Roman" w:cs="Times New Roman"/>
-          <w:sz w:val="24"/>
-          <w:szCs w:val="24"/>
-        </w:rPr>
-        <w:t xml:space="preserve"> is only for dependency)</w:t>
+        <w:t>.\venv\bin\Activate.ps1</w:t>
+      </w:r>
+    </w:p>
+    <w:p>
+      <w:pPr>
+        <w:rPr>
+          <w:rFonts w:ascii="Times New Roman" w:hAnsi="Times New Roman" w:cs="Times New Roman"/>
+          <w:sz w:val="24"/>
+          <w:szCs w:val="24"/>
+        </w:rPr>
+      </w:pPr>
+    </w:p>
+    <w:p>
+      <w:pPr>
+        <w:rPr>
+          <w:rFonts w:ascii="Times New Roman" w:hAnsi="Times New Roman" w:cs="Times New Roman"/>
+          <w:sz w:val="24"/>
+          <w:szCs w:val="24"/>
+        </w:rPr>
+      </w:pPr>
+      <w:r>
+        <w:rPr>
+          <w:rFonts w:ascii="Times New Roman" w:hAnsi="Times New Roman" w:cs="Times New Roman"/>
+          <w:sz w:val="24"/>
+          <w:szCs w:val="24"/>
+        </w:rPr>
+        <w:t>Next Step : Make  a folder inside safe-au</w:t>
+      </w:r>
+      <w:r>
+        <w:rPr>
+          <w:rFonts w:ascii="Times New Roman" w:hAnsi="Times New Roman" w:cs="Times New Roman"/>
+          <w:sz w:val="24"/>
+          <w:szCs w:val="24"/>
+        </w:rPr>
+        <w:t>dio-backend not in venv(venv is only for dependency)</w:t>
       </w:r>
     </w:p>
     <w:p>
@@ -478,23 +322,13 @@
           <w:szCs w:val="24"/>
         </w:rPr>
       </w:pPr>
-      <w:proofErr w:type="spellStart"/>
-      <w:r>
-        <w:rPr>
-          <w:rFonts w:ascii="Times New Roman" w:hAnsi="Times New Roman" w:cs="Times New Roman"/>
-          <w:sz w:val="24"/>
-          <w:szCs w:val="24"/>
-        </w:rPr>
-        <w:t>Npm</w:t>
-      </w:r>
-      <w:proofErr w:type="spellEnd"/>
-      <w:r>
-        <w:rPr>
-          <w:rFonts w:ascii="Times New Roman" w:hAnsi="Times New Roman" w:cs="Times New Roman"/>
-          <w:sz w:val="24"/>
-          <w:szCs w:val="24"/>
-        </w:rPr>
-        <w:t xml:space="preserve"> run dev</w:t>
+      <w:r>
+        <w:rPr>
+          <w:rFonts w:ascii="Times New Roman" w:hAnsi="Times New Roman" w:cs="Times New Roman"/>
+          <w:sz w:val="24"/>
+          <w:szCs w:val="24"/>
+        </w:rPr>
+        <w:t>Npm run dev</w:t>
       </w:r>
       <w:r>
         <w:rPr>
@@ -538,43 +372,7 @@
           <w:sz w:val="24"/>
           <w:szCs w:val="24"/>
         </w:rPr>
-        <w:t xml:space="preserve">Look if we have a problem in downloading on python error we </w:t>
-      </w:r>
-      <w:proofErr w:type="gramStart"/>
-      <w:r>
-        <w:rPr>
-          <w:rFonts w:ascii="Times New Roman" w:hAnsi="Times New Roman" w:cs="Times New Roman"/>
-          <w:sz w:val="24"/>
-          <w:szCs w:val="24"/>
-        </w:rPr>
-        <w:t>have to</w:t>
-      </w:r>
-      <w:proofErr w:type="gramEnd"/>
-      <w:r>
-        <w:rPr>
-          <w:rFonts w:ascii="Times New Roman" w:hAnsi="Times New Roman" w:cs="Times New Roman"/>
-          <w:sz w:val="24"/>
-          <w:szCs w:val="24"/>
-        </w:rPr>
-        <w:t xml:space="preserve"> just delete </w:t>
-      </w:r>
-      <w:proofErr w:type="spellStart"/>
-      <w:r>
-        <w:rPr>
-          <w:rFonts w:ascii="Times New Roman" w:hAnsi="Times New Roman" w:cs="Times New Roman"/>
-          <w:sz w:val="24"/>
-          <w:szCs w:val="24"/>
-        </w:rPr>
-        <w:t>venv</w:t>
-      </w:r>
-      <w:proofErr w:type="spellEnd"/>
-      <w:r>
-        <w:rPr>
-          <w:rFonts w:ascii="Times New Roman" w:hAnsi="Times New Roman" w:cs="Times New Roman"/>
-          <w:sz w:val="24"/>
-          <w:szCs w:val="24"/>
-        </w:rPr>
-        <w:t xml:space="preserve"> folder and reinstall it with the command</w:t>
+        <w:t>Look if we have a problem in downloading on python error we have to just delete venv folder and reinstall it with the command</w:t>
       </w:r>
       <w:r>
         <w:rPr>
@@ -590,18 +388,245 @@
           <w:sz w:val="24"/>
           <w:szCs w:val="24"/>
         </w:rPr>
-        <w:t xml:space="preserve">"C:\Users\Dakshrana\AppData\Local\Programs\Python\Python313\python.exe" -m </w:t>
-      </w:r>
-      <w:proofErr w:type="spellStart"/>
-      <w:r>
-        <w:rPr>
-          <w:rFonts w:ascii="Times New Roman" w:hAnsi="Times New Roman" w:cs="Times New Roman"/>
-          <w:sz w:val="24"/>
-          <w:szCs w:val="24"/>
-        </w:rPr>
-        <w:t>venv</w:t>
-      </w:r>
-      <w:proofErr w:type="spellEnd"/>
+        <w:t>"C:\Users\Dakshrana\AppData\Local\Programs\Python\Python313\python.exe" -m venv venv</w:t>
+      </w:r>
+      <w:r>
+        <w:rPr>
+          <w:rFonts w:ascii="Times New Roman" w:hAnsi="Times New Roman" w:cs="Times New Roman"/>
+          <w:sz w:val="24"/>
+          <w:szCs w:val="24"/>
+        </w:rPr>
+        <w:br/>
+      </w:r>
+      <w:r>
+        <w:rPr>
+          <w:rFonts w:ascii="Times New Roman" w:hAnsi="Times New Roman" w:cs="Times New Roman"/>
+          <w:sz w:val="24"/>
+          <w:szCs w:val="24"/>
+        </w:rPr>
+        <w:br/>
+      </w:r>
+    </w:p>
+    <w:p>
+      <w:pPr>
+        <w:rPr>
+          <w:rFonts w:ascii="Times New Roman" w:hAnsi="Times New Roman" w:cs="Times New Roman"/>
+          <w:sz w:val="24"/>
+          <w:szCs w:val="24"/>
+        </w:rPr>
+      </w:pPr>
+      <w:r>
+        <w:rPr>
+          <w:rFonts w:ascii="Times New Roman" w:hAnsi="Times New Roman" w:cs="Times New Roman"/>
+          <w:sz w:val="24"/>
+          <w:szCs w:val="24"/>
+        </w:rPr>
+        <w:t>To activate the venv folder</w:t>
+      </w:r>
+      <w:r>
+        <w:rPr>
+          <w:rFonts w:ascii="Times New Roman" w:hAnsi="Times New Roman" w:cs="Times New Roman"/>
+          <w:sz w:val="24"/>
+          <w:szCs w:val="24"/>
+        </w:rPr>
+        <w:br/>
+        <w:t>.\venv\Scripts\Activate.ps1</w:t>
+      </w:r>
+    </w:p>
+    <w:p>
+      <w:pPr>
+        <w:rPr>
+          <w:rFonts w:ascii="Times New Roman" w:hAnsi="Times New Roman" w:cs="Times New Roman"/>
+          <w:sz w:val="24"/>
+          <w:szCs w:val="24"/>
+        </w:rPr>
+      </w:pPr>
+      <w:r>
+        <w:rPr>
+          <w:rFonts w:ascii="Times New Roman" w:hAnsi="Times New Roman" w:cs="Times New Roman"/>
+          <w:sz w:val="24"/>
+          <w:szCs w:val="24"/>
+        </w:rPr>
+        <w:br/>
+      </w:r>
+      <w:r>
+        <w:rPr>
+          <w:rFonts w:ascii="Times New Roman" w:hAnsi="Times New Roman" w:cs="Times New Roman"/>
+          <w:sz w:val="24"/>
+          <w:szCs w:val="24"/>
+        </w:rPr>
+        <w:br/>
+        <w:t>Then install all of these dependencies :</w:t>
+      </w:r>
+      <w:r>
+        <w:rPr>
+          <w:rFonts w:ascii="Times New Roman" w:hAnsi="Times New Roman" w:cs="Times New Roman"/>
+          <w:sz w:val="24"/>
+          <w:szCs w:val="24"/>
+        </w:rPr>
+        <w:br/>
+      </w:r>
+      <w:r>
+        <w:rPr>
+          <w:rFonts w:ascii="Times New Roman" w:hAnsi="Times New Roman" w:cs="Times New Roman"/>
+          <w:sz w:val="24"/>
+          <w:szCs w:val="24"/>
+        </w:rPr>
+        <w:t>pip install flask flask-socketio simple-websocket google-generativeai</w:t>
+      </w:r>
+    </w:p>
+    <w:p>
+      <w:pPr>
+        <w:rPr>
+          <w:rFonts w:ascii="Times New Roman" w:hAnsi="Times New Roman" w:cs="Times New Roman"/>
+          <w:sz w:val="24"/>
+          <w:szCs w:val="24"/>
+        </w:rPr>
+      </w:pPr>
+    </w:p>
+    <w:p>
+      <w:pPr>
+        <w:rPr>
+          <w:rFonts w:ascii="Times New Roman" w:hAnsi="Times New Roman" w:cs="Times New Roman"/>
+          <w:sz w:val="24"/>
+          <w:szCs w:val="24"/>
+        </w:rPr>
+      </w:pPr>
+      <w:r>
+        <w:rPr>
+          <w:rFonts w:ascii="Times New Roman" w:hAnsi="Times New Roman" w:cs="Times New Roman"/>
+          <w:sz w:val="24"/>
+          <w:szCs w:val="24"/>
+        </w:rPr>
+        <w:t>So we build our project but the problem is we are using free api so we can’t make many call simultaneously so we make some if else statement , we use api model when it’s necessary.</w:t>
+      </w:r>
+      <w:r>
+        <w:rPr>
+          <w:rFonts w:ascii="Times New Roman" w:hAnsi="Times New Roman" w:cs="Times New Roman"/>
+          <w:sz w:val="24"/>
+          <w:szCs w:val="24"/>
+        </w:rPr>
+        <w:br/>
+      </w:r>
+    </w:p>
+    <w:p>
+      <w:pPr>
+        <w:rPr>
+          <w:rFonts w:ascii="Times New Roman" w:hAnsi="Times New Roman" w:cs="Times New Roman"/>
+          <w:sz w:val="24"/>
+          <w:szCs w:val="24"/>
+        </w:rPr>
+      </w:pPr>
+      <w:r>
+        <w:rPr>
+          <w:rFonts w:ascii="Times New Roman" w:hAnsi="Times New Roman" w:cs="Times New Roman"/>
+          <w:sz w:val="24"/>
+          <w:szCs w:val="24"/>
+        </w:rPr>
+        <w:t>But the answer are so wrong . the solution is we record only one voice per click.</w:t>
+      </w:r>
+      <w:r>
+        <w:rPr>
+          <w:rFonts w:ascii="Times New Roman" w:hAnsi="Times New Roman" w:cs="Times New Roman"/>
+          <w:sz w:val="24"/>
+          <w:szCs w:val="24"/>
+        </w:rPr>
+        <w:br/>
+        <w:t>but this make our project so stupid.</w:t>
+      </w:r>
+      <w:r>
+        <w:rPr>
+          <w:rFonts w:ascii="Times New Roman" w:hAnsi="Times New Roman" w:cs="Times New Roman"/>
+          <w:sz w:val="24"/>
+          <w:szCs w:val="24"/>
+        </w:rPr>
+        <w:br/>
+      </w:r>
+      <w:r>
+        <w:rPr>
+          <w:rFonts w:ascii="Times New Roman" w:hAnsi="Times New Roman" w:cs="Times New Roman"/>
+          <w:sz w:val="24"/>
+          <w:szCs w:val="24"/>
+        </w:rPr>
+        <w:br/>
+        <w:t>So now currently I am developing my new local model and using api when needed</w:t>
+      </w:r>
+    </w:p>
+    <w:p>
+      <w:pPr>
+        <w:rPr>
+          <w:rFonts w:ascii="Times New Roman" w:hAnsi="Times New Roman" w:cs="Times New Roman"/>
+          <w:sz w:val="24"/>
+          <w:szCs w:val="24"/>
+        </w:rPr>
+      </w:pPr>
+      <w:r>
+        <w:rPr>
+          <w:rFonts w:ascii="Times New Roman" w:hAnsi="Times New Roman" w:cs="Times New Roman"/>
+          <w:sz w:val="24"/>
+          <w:szCs w:val="24"/>
+        </w:rPr>
+        <w:t>First dependency:</w:t>
+      </w:r>
+      <w:r>
+        <w:rPr>
+          <w:rFonts w:ascii="Times New Roman" w:hAnsi="Times New Roman" w:cs="Times New Roman"/>
+          <w:sz w:val="24"/>
+          <w:szCs w:val="24"/>
+        </w:rPr>
+        <w:br/>
+      </w:r>
+      <w:r>
+        <w:rPr>
+          <w:rFonts w:ascii="Times New Roman" w:hAnsi="Times New Roman" w:cs="Times New Roman"/>
+          <w:sz w:val="24"/>
+          <w:szCs w:val="24"/>
+        </w:rPr>
+        <w:t>pip install scikit-learn numpy</w:t>
+      </w:r>
+    </w:p>
+    <w:p>
+      <w:pPr>
+        <w:rPr>
+          <w:rFonts w:ascii="Times New Roman" w:hAnsi="Times New Roman" w:cs="Times New Roman"/>
+          <w:sz w:val="24"/>
+          <w:szCs w:val="24"/>
+        </w:rPr>
+      </w:pPr>
+    </w:p>
+    <w:p>
+      <w:pPr>
+        <w:rPr>
+          <w:rFonts w:ascii="Times New Roman" w:hAnsi="Times New Roman" w:cs="Times New Roman"/>
+          <w:sz w:val="24"/>
+          <w:szCs w:val="24"/>
+        </w:rPr>
+      </w:pPr>
+      <w:r>
+        <w:rPr>
+          <w:rFonts w:ascii="Times New Roman" w:hAnsi="Times New Roman" w:cs="Times New Roman"/>
+          <w:sz w:val="24"/>
+          <w:szCs w:val="24"/>
+        </w:rPr>
+        <w:t xml:space="preserve">Making a folder  name </w:t>
+      </w:r>
+    </w:p>
+    <w:p>
+      <w:pPr>
+        <w:rPr>
+          <w:rFonts w:ascii="Times New Roman" w:hAnsi="Times New Roman" w:cs="Times New Roman"/>
+          <w:sz w:val="24"/>
+          <w:szCs w:val="24"/>
+        </w:rPr>
+      </w:pPr>
+      <w:r>
+        <w:rPr>
+          <w:rFonts w:ascii="Times New Roman" w:hAnsi="Times New Roman" w:cs="Times New Roman"/>
+          <w:sz w:val="24"/>
+          <w:szCs w:val="24"/>
+        </w:rPr>
+        <w:t>train_model.py</w:t>
+      </w:r>
       <w:r>
         <w:rPr>
           <w:rFonts w:ascii="Times New Roman" w:hAnsi="Times New Roman" w:cs="Times New Roman"/>
@@ -610,16 +635,32 @@
         </w:rPr>
         <w:t xml:space="preserve"> </w:t>
       </w:r>
-      <w:proofErr w:type="spellStart"/>
-      <w:r>
-        <w:rPr>
-          <w:rFonts w:ascii="Times New Roman" w:hAnsi="Times New Roman" w:cs="Times New Roman"/>
-          <w:sz w:val="24"/>
-          <w:szCs w:val="24"/>
-        </w:rPr>
-        <w:t>venv</w:t>
-      </w:r>
-      <w:proofErr w:type="spellEnd"/>
+    </w:p>
+    <w:p>
+      <w:pPr>
+        <w:rPr>
+          <w:rFonts w:ascii="Times New Roman" w:hAnsi="Times New Roman" w:cs="Times New Roman"/>
+          <w:sz w:val="24"/>
+          <w:szCs w:val="24"/>
+        </w:rPr>
+      </w:pPr>
+    </w:p>
+    <w:p>
+      <w:pPr>
+        <w:rPr>
+          <w:rFonts w:ascii="Times New Roman" w:hAnsi="Times New Roman" w:cs="Times New Roman"/>
+          <w:sz w:val="24"/>
+          <w:szCs w:val="24"/>
+        </w:rPr>
+      </w:pPr>
+      <w:r>
+        <w:rPr>
+          <w:rFonts w:ascii="Times New Roman" w:hAnsi="Times New Roman" w:cs="Times New Roman"/>
+          <w:sz w:val="24"/>
+          <w:szCs w:val="24"/>
+        </w:rPr>
+        <w:t>and run  it</w:t>
+      </w:r>
       <w:r>
         <w:rPr>
           <w:rFonts w:ascii="Times New Roman" w:hAnsi="Times New Roman" w:cs="Times New Roman"/>
@@ -636,191 +677,318 @@
         </w:rPr>
         <w:br/>
       </w:r>
-    </w:p>
-    <w:p>
-      <w:pPr>
-        <w:rPr>
-          <w:rFonts w:ascii="Times New Roman" w:hAnsi="Times New Roman" w:cs="Times New Roman"/>
-          <w:sz w:val="24"/>
-          <w:szCs w:val="24"/>
-        </w:rPr>
-      </w:pPr>
-      <w:r>
-        <w:rPr>
-          <w:rFonts w:ascii="Times New Roman" w:hAnsi="Times New Roman" w:cs="Times New Roman"/>
-          <w:sz w:val="24"/>
-          <w:szCs w:val="24"/>
-        </w:rPr>
-        <w:t xml:space="preserve">To activate the </w:t>
-      </w:r>
-      <w:proofErr w:type="spellStart"/>
-      <w:r>
-        <w:rPr>
-          <w:rFonts w:ascii="Times New Roman" w:hAnsi="Times New Roman" w:cs="Times New Roman"/>
-          <w:sz w:val="24"/>
-          <w:szCs w:val="24"/>
-        </w:rPr>
-        <w:t>venv</w:t>
-      </w:r>
-      <w:proofErr w:type="spellEnd"/>
-      <w:r>
-        <w:rPr>
-          <w:rFonts w:ascii="Times New Roman" w:hAnsi="Times New Roman" w:cs="Times New Roman"/>
-          <w:sz w:val="24"/>
-          <w:szCs w:val="24"/>
-        </w:rPr>
-        <w:t xml:space="preserve"> folder</w:t>
-      </w:r>
-      <w:r>
-        <w:rPr>
-          <w:rFonts w:ascii="Times New Roman" w:hAnsi="Times New Roman" w:cs="Times New Roman"/>
-          <w:sz w:val="24"/>
-          <w:szCs w:val="24"/>
-        </w:rPr>
-        <w:br/>
-      </w:r>
-      <w:r>
-        <w:rPr>
-          <w:rFonts w:ascii="Times New Roman" w:hAnsi="Times New Roman" w:cs="Times New Roman"/>
-          <w:sz w:val="24"/>
-          <w:szCs w:val="24"/>
-        </w:rPr>
-        <w:t>.\</w:t>
-      </w:r>
-      <w:proofErr w:type="spellStart"/>
-      <w:r>
-        <w:rPr>
-          <w:rFonts w:ascii="Times New Roman" w:hAnsi="Times New Roman" w:cs="Times New Roman"/>
-          <w:sz w:val="24"/>
-          <w:szCs w:val="24"/>
-        </w:rPr>
-        <w:t>venv</w:t>
-      </w:r>
-      <w:proofErr w:type="spellEnd"/>
-      <w:r>
-        <w:rPr>
-          <w:rFonts w:ascii="Times New Roman" w:hAnsi="Times New Roman" w:cs="Times New Roman"/>
-          <w:sz w:val="24"/>
-          <w:szCs w:val="24"/>
-        </w:rPr>
-        <w:t>\Scripts\Activate.ps1</w:t>
-      </w:r>
-    </w:p>
-    <w:p>
-      <w:pPr>
-        <w:rPr>
-          <w:rFonts w:ascii="Times New Roman" w:hAnsi="Times New Roman" w:cs="Times New Roman"/>
-          <w:sz w:val="24"/>
-          <w:szCs w:val="24"/>
-        </w:rPr>
-      </w:pPr>
-      <w:r>
-        <w:rPr>
-          <w:rFonts w:ascii="Times New Roman" w:hAnsi="Times New Roman" w:cs="Times New Roman"/>
-          <w:sz w:val="24"/>
-          <w:szCs w:val="24"/>
-        </w:rPr>
-        <w:br/>
-      </w:r>
-      <w:r>
-        <w:rPr>
-          <w:rFonts w:ascii="Times New Roman" w:hAnsi="Times New Roman" w:cs="Times New Roman"/>
-          <w:sz w:val="24"/>
-          <w:szCs w:val="24"/>
-        </w:rPr>
-        <w:br/>
-        <w:t xml:space="preserve">Then install </w:t>
-      </w:r>
-      <w:proofErr w:type="gramStart"/>
-      <w:r>
-        <w:rPr>
-          <w:rFonts w:ascii="Times New Roman" w:hAnsi="Times New Roman" w:cs="Times New Roman"/>
-          <w:sz w:val="24"/>
-          <w:szCs w:val="24"/>
-        </w:rPr>
-        <w:t>all of</w:t>
-      </w:r>
-      <w:proofErr w:type="gramEnd"/>
-      <w:r>
-        <w:rPr>
-          <w:rFonts w:ascii="Times New Roman" w:hAnsi="Times New Roman" w:cs="Times New Roman"/>
-          <w:sz w:val="24"/>
-          <w:szCs w:val="24"/>
-        </w:rPr>
-        <w:t xml:space="preserve"> these </w:t>
-      </w:r>
-      <w:proofErr w:type="gramStart"/>
-      <w:r>
-        <w:rPr>
-          <w:rFonts w:ascii="Times New Roman" w:hAnsi="Times New Roman" w:cs="Times New Roman"/>
-          <w:sz w:val="24"/>
-          <w:szCs w:val="24"/>
-        </w:rPr>
-        <w:t>dependencies :</w:t>
-      </w:r>
-      <w:proofErr w:type="gramEnd"/>
-      <w:r>
-        <w:rPr>
-          <w:rFonts w:ascii="Times New Roman" w:hAnsi="Times New Roman" w:cs="Times New Roman"/>
-          <w:sz w:val="24"/>
-          <w:szCs w:val="24"/>
-        </w:rPr>
-        <w:br/>
-      </w:r>
-      <w:r>
-        <w:rPr>
-          <w:rFonts w:ascii="Times New Roman" w:hAnsi="Times New Roman" w:cs="Times New Roman"/>
-          <w:sz w:val="24"/>
-          <w:szCs w:val="24"/>
-        </w:rPr>
-        <w:t>pip install flask flask-</w:t>
-      </w:r>
-      <w:proofErr w:type="spellStart"/>
-      <w:r>
-        <w:rPr>
-          <w:rFonts w:ascii="Times New Roman" w:hAnsi="Times New Roman" w:cs="Times New Roman"/>
-          <w:sz w:val="24"/>
-          <w:szCs w:val="24"/>
-        </w:rPr>
-        <w:t>socketio</w:t>
-      </w:r>
-      <w:proofErr w:type="spellEnd"/>
-      <w:r>
-        <w:rPr>
-          <w:rFonts w:ascii="Times New Roman" w:hAnsi="Times New Roman" w:cs="Times New Roman"/>
-          <w:sz w:val="24"/>
-          <w:szCs w:val="24"/>
-        </w:rPr>
-        <w:t xml:space="preserve"> simple-</w:t>
-      </w:r>
-      <w:proofErr w:type="spellStart"/>
-      <w:r>
-        <w:rPr>
-          <w:rFonts w:ascii="Times New Roman" w:hAnsi="Times New Roman" w:cs="Times New Roman"/>
-          <w:sz w:val="24"/>
-          <w:szCs w:val="24"/>
-        </w:rPr>
-        <w:t>websocket</w:t>
-      </w:r>
-      <w:proofErr w:type="spellEnd"/>
-      <w:r>
-        <w:rPr>
-          <w:rFonts w:ascii="Times New Roman" w:hAnsi="Times New Roman" w:cs="Times New Roman"/>
-          <w:sz w:val="24"/>
-          <w:szCs w:val="24"/>
-        </w:rPr>
-        <w:t xml:space="preserve"> google-</w:t>
-      </w:r>
-      <w:proofErr w:type="spellStart"/>
-      <w:r>
-        <w:rPr>
-          <w:rFonts w:ascii="Times New Roman" w:hAnsi="Times New Roman" w:cs="Times New Roman"/>
-          <w:sz w:val="24"/>
-          <w:szCs w:val="24"/>
-        </w:rPr>
-        <w:t>generativeai</w:t>
-      </w:r>
-      <w:proofErr w:type="spellEnd"/>
+      <w:r>
+        <w:rPr>
+          <w:rFonts w:ascii="Times New Roman" w:hAnsi="Times New Roman" w:cs="Times New Roman"/>
+          <w:sz w:val="24"/>
+          <w:szCs w:val="24"/>
+        </w:rPr>
+        <w:t>[12:18:35 PM] Spoken Context: "so you know that ingredient in burban art define the flower method sugar edible vegetable oil"</w:t>
+      </w:r>
+    </w:p>
+    <w:p>
+      <w:pPr>
+        <w:rPr>
+          <w:rFonts w:ascii="Times New Roman" w:hAnsi="Times New Roman" w:cs="Times New Roman"/>
+          <w:sz w:val="24"/>
+          <w:szCs w:val="24"/>
+        </w:rPr>
+      </w:pPr>
+      <w:r>
+        <w:rPr>
+          <w:rFonts w:ascii="Times New Roman" w:hAnsi="Times New Roman" w:cs="Times New Roman"/>
+          <w:sz w:val="24"/>
+          <w:szCs w:val="24"/>
+        </w:rPr>
+        <w:t>[12:18:22 PM] Microphone listening active (Hands-Free Mode)...</w:t>
+      </w:r>
+    </w:p>
+    <w:p>
+      <w:pPr>
+        <w:rPr>
+          <w:rFonts w:ascii="Times New Roman" w:hAnsi="Times New Roman" w:cs="Times New Roman"/>
+          <w:sz w:val="24"/>
+          <w:szCs w:val="24"/>
+        </w:rPr>
+      </w:pPr>
+      <w:r>
+        <w:rPr>
+          <w:rFonts w:ascii="Times New Roman" w:hAnsi="Times New Roman" w:cs="Times New Roman"/>
+          <w:sz w:val="24"/>
+          <w:szCs w:val="24"/>
+        </w:rPr>
+        <w:t>[12:18:07 PM] Connected to Python WebSocket pipeline</w:t>
+      </w:r>
+    </w:p>
+    <w:p>
+      <w:pPr>
+        <w:rPr>
+          <w:rFonts w:ascii="Times New Roman" w:hAnsi="Times New Roman" w:cs="Times New Roman"/>
+          <w:sz w:val="24"/>
+          <w:szCs w:val="24"/>
+        </w:rPr>
+      </w:pPr>
+      <w:r>
+        <w:rPr>
+          <w:rFonts w:ascii="Times New Roman" w:hAnsi="Times New Roman" w:cs="Times New Roman"/>
+          <w:sz w:val="24"/>
+          <w:szCs w:val="24"/>
+        </w:rPr>
+        <w:t>[12:18:04 PM] Disconnected from Python server</w:t>
+      </w:r>
+    </w:p>
+    <w:p>
+      <w:pPr>
+        <w:rPr>
+          <w:rFonts w:ascii="Times New Roman" w:hAnsi="Times New Roman" w:cs="Times New Roman"/>
+          <w:sz w:val="24"/>
+          <w:szCs w:val="24"/>
+        </w:rPr>
+      </w:pPr>
+      <w:r>
+        <w:rPr>
+          <w:rFonts w:ascii="Times New Roman" w:hAnsi="Times New Roman" w:cs="Times New Roman"/>
+          <w:sz w:val="24"/>
+          <w:szCs w:val="24"/>
+        </w:rPr>
+        <w:t>[12:16:38 PM] Microphone deactivated safely.</w:t>
+      </w:r>
+    </w:p>
+    <w:p>
+      <w:pPr>
+        <w:rPr>
+          <w:rFonts w:ascii="Times New Roman" w:hAnsi="Times New Roman" w:cs="Times New Roman"/>
+          <w:sz w:val="24"/>
+          <w:szCs w:val="24"/>
+        </w:rPr>
+      </w:pPr>
+      <w:r>
+        <w:rPr>
+          <w:rFonts w:ascii="Times New Roman" w:hAnsi="Times New Roman" w:cs="Times New Roman"/>
+          <w:sz w:val="24"/>
+          <w:szCs w:val="24"/>
+        </w:rPr>
+        <w:t>[12:16:24 PM] Server Engine: undefined</w:t>
+      </w:r>
+    </w:p>
+    <w:p>
+      <w:pPr>
+        <w:rPr>
+          <w:rFonts w:ascii="Times New Roman" w:hAnsi="Times New Roman" w:cs="Times New Roman"/>
+          <w:sz w:val="24"/>
+          <w:szCs w:val="24"/>
+        </w:rPr>
+      </w:pPr>
+      <w:r>
+        <w:rPr>
+          <w:rFonts w:ascii="Times New Roman" w:hAnsi="Times New Roman" w:cs="Times New Roman"/>
+          <w:sz w:val="24"/>
+          <w:szCs w:val="24"/>
+        </w:rPr>
+        <w:t>[12:16:24 PM] Spoken Context: "has been accident please help help there has been excellent"</w:t>
+      </w:r>
+    </w:p>
+    <w:p>
+      <w:pPr>
+        <w:rPr>
+          <w:rFonts w:ascii="Times New Roman" w:hAnsi="Times New Roman" w:cs="Times New Roman"/>
+          <w:sz w:val="24"/>
+          <w:szCs w:val="24"/>
+        </w:rPr>
+      </w:pPr>
+      <w:r>
+        <w:rPr>
+          <w:rFonts w:ascii="Times New Roman" w:hAnsi="Times New Roman" w:cs="Times New Roman"/>
+          <w:sz w:val="24"/>
+          <w:szCs w:val="24"/>
+        </w:rPr>
+        <w:t>[12:16:14 PM] Server Engine: undefined</w:t>
+      </w:r>
+    </w:p>
+    <w:p>
+      <w:pPr>
+        <w:rPr>
+          <w:rFonts w:ascii="Times New Roman" w:hAnsi="Times New Roman" w:cs="Times New Roman"/>
+          <w:sz w:val="24"/>
+          <w:szCs w:val="24"/>
+        </w:rPr>
+      </w:pPr>
+      <w:r>
+        <w:rPr>
+          <w:rFonts w:ascii="Times New Roman" w:hAnsi="Times New Roman" w:cs="Times New Roman"/>
+          <w:sz w:val="24"/>
+          <w:szCs w:val="24"/>
+        </w:rPr>
+        <w:t>[12:16:14 PM] Spoken Context: "hey hey there has been many so but we are going to be a daymation from here to go to"</w:t>
+      </w:r>
+    </w:p>
+    <w:p>
+      <w:pPr>
+        <w:rPr>
+          <w:rFonts w:ascii="Times New Roman" w:hAnsi="Times New Roman" w:cs="Times New Roman"/>
+          <w:sz w:val="24"/>
+          <w:szCs w:val="24"/>
+        </w:rPr>
+      </w:pPr>
+      <w:r>
+        <w:rPr>
+          <w:rFonts w:ascii="Times New Roman" w:hAnsi="Times New Roman" w:cs="Times New Roman"/>
+          <w:sz w:val="24"/>
+          <w:szCs w:val="24"/>
+        </w:rPr>
+        <w:t>[12:15:55 PM] Microphone listening active (Hands-Free Mode)...</w:t>
+      </w:r>
+    </w:p>
+    <w:p>
+      <w:pPr>
+        <w:rPr>
+          <w:rFonts w:ascii="Times New Roman" w:hAnsi="Times New Roman" w:cs="Times New Roman"/>
+          <w:sz w:val="24"/>
+          <w:szCs w:val="24"/>
+        </w:rPr>
+      </w:pPr>
+      <w:r>
+        <w:rPr>
+          <w:rFonts w:ascii="Times New Roman" w:hAnsi="Times New Roman" w:cs="Times New Roman"/>
+          <w:sz w:val="24"/>
+          <w:szCs w:val="24"/>
+        </w:rPr>
+        <w:t>[12:15:39 PM] Connected to Python WebSocket pipeline</w:t>
+      </w:r>
+    </w:p>
+    <w:p>
+      <w:pPr>
+        <w:rPr>
+          <w:rFonts w:ascii="Times New Roman" w:hAnsi="Times New Roman" w:cs="Times New Roman"/>
+          <w:sz w:val="24"/>
+          <w:szCs w:val="24"/>
+        </w:rPr>
+      </w:pPr>
+      <w:r>
+        <w:rPr>
+          <w:rFonts w:ascii="Times New Roman" w:hAnsi="Times New Roman" w:cs="Times New Roman"/>
+          <w:sz w:val="24"/>
+          <w:szCs w:val="24"/>
+        </w:rPr>
+        <w:t>[12:18:54 PM] Microphone deactivated safely.</w:t>
+      </w:r>
+    </w:p>
+    <w:p>
+      <w:pPr>
+        <w:rPr>
+          <w:rFonts w:ascii="Times New Roman" w:hAnsi="Times New Roman" w:cs="Times New Roman"/>
+          <w:sz w:val="24"/>
+          <w:szCs w:val="24"/>
+        </w:rPr>
+      </w:pPr>
+      <w:r>
+        <w:rPr>
+          <w:rFonts w:ascii="Times New Roman" w:hAnsi="Times New Roman" w:cs="Times New Roman"/>
+          <w:sz w:val="24"/>
+          <w:szCs w:val="24"/>
+        </w:rPr>
+        <w:t xml:space="preserve">[12:18:50 PM] </w:t>
+      </w:r>
+      <w:r>
+        <w:rPr>
+          <w:rFonts w:ascii="Segoe UI Emoji" w:hAnsi="Segoe UI Emoji" w:cs="Segoe UI Emoji"/>
+          <w:sz w:val="24"/>
+          <w:szCs w:val="24"/>
+        </w:rPr>
+        <w:t>🚨</w:t>
+      </w:r>
+      <w:r>
+        <w:rPr>
+          <w:rFonts w:ascii="Times New Roman" w:hAnsi="Times New Roman" w:cs="Times New Roman"/>
+          <w:sz w:val="24"/>
+          <w:szCs w:val="24"/>
+        </w:rPr>
+        <w:t xml:space="preserve"> ALARM: ACCIDENT, HELP, CALL AMBULANCE.</w:t>
+      </w:r>
+    </w:p>
+    <w:p>
+      <w:pPr>
+        <w:rPr>
+          <w:rFonts w:ascii="Times New Roman" w:hAnsi="Times New Roman" w:cs="Times New Roman"/>
+          <w:sz w:val="24"/>
+          <w:szCs w:val="24"/>
+        </w:rPr>
+      </w:pPr>
+      <w:r>
+        <w:rPr>
+          <w:rFonts w:ascii="Times New Roman" w:hAnsi="Times New Roman" w:cs="Times New Roman"/>
+          <w:sz w:val="24"/>
+          <w:szCs w:val="24"/>
+        </w:rPr>
+        <w:t>[12:18:48 PM] Spoken Context: "coconut so oh my god oh my god there is he has an accident please help with them someone call the ambulance ambulance ambulance"</w:t>
+      </w:r>
+    </w:p>
+    <w:p>
+      <w:pPr>
+        <w:rPr>
+          <w:rFonts w:ascii="Times New Roman" w:hAnsi="Times New Roman" w:cs="Times New Roman"/>
+          <w:sz w:val="24"/>
+          <w:szCs w:val="24"/>
+        </w:rPr>
+      </w:pPr>
+      <w:r>
+        <w:rPr>
+          <w:rFonts w:ascii="Times New Roman" w:hAnsi="Times New Roman" w:cs="Times New Roman"/>
+          <w:sz w:val="24"/>
+          <w:szCs w:val="24"/>
+        </w:rPr>
+        <w:t>[12:18:35 PM] Server Engine: Safe (Local Execution)</w:t>
+      </w:r>
+    </w:p>
+    <w:p>
+      <w:pPr>
+        <w:rPr>
+          <w:rFonts w:ascii="Times New Roman" w:hAnsi="Times New Roman" w:cs="Times New Roman"/>
+          <w:sz w:val="24"/>
+          <w:szCs w:val="24"/>
+        </w:rPr>
+      </w:pPr>
+      <w:r>
+        <w:rPr>
+          <w:noProof/>
+        </w:rPr>
+        <w:lastRenderedPageBreak/>
+        <w:drawing>
+          <wp:inline distT="0" distB="0" distL="0" distR="0" wp14:anchorId="52A09DCC" wp14:editId="1ADC4470">
+            <wp:extent cx="5731510" cy="3745230"/>
+            <wp:effectExtent l="0" t="0" r="2540" b="7620"/>
+            <wp:docPr id="603189114" name="Picture 1"/>
+            <wp:cNvGraphicFramePr>
+              <a:graphicFrameLocks xmlns:a="http://schemas.openxmlformats.org/drawingml/2006/main" noChangeAspect="1"/>
+            </wp:cNvGraphicFramePr>
+            <a:graphic xmlns:a="http://schemas.openxmlformats.org/drawingml/2006/main">
+              <a:graphicData uri="http://schemas.openxmlformats.org/drawingml/2006/picture">
+                <pic:pic xmlns:pic="http://schemas.openxmlformats.org/drawingml/2006/picture">
+                  <pic:nvPicPr>
+                    <pic:cNvPr id="603189114" name=""/>
+                    <pic:cNvPicPr/>
+                  </pic:nvPicPr>
+                  <pic:blipFill>
+                    <a:blip r:embed="rId5"/>
+                    <a:stretch>
+                      <a:fillRect/>
+                    </a:stretch>
+                  </pic:blipFill>
+                  <pic:spPr>
+                    <a:xfrm>
+                      <a:off x="0" y="0"/>
+                      <a:ext cx="5731510" cy="3745230"/>
+                    </a:xfrm>
+                    <a:prstGeom prst="rect">
+                      <a:avLst/>
+                    </a:prstGeom>
+                  </pic:spPr>
+                </pic:pic>
+              </a:graphicData>
+            </a:graphic>
+          </wp:inline>
+        </w:drawing>
+      </w:r>
     </w:p>
     <w:sectPr>
       <w:pgSz w:w="11906" w:h="16838"/>
@@ -1435,7 +1603,6 @@
   <w:style w:type="character" w:default="1" w:styleId="DefaultParagraphFont">
     <w:name w:val="Default Paragraph Font"/>
     <w:uiPriority w:val="1"/>
-    <w:semiHidden/>
     <w:unhideWhenUsed/>
   </w:style>
   <w:style w:type="table" w:default="1" w:styleId="TableNormal">

</xml_diff>